<commit_message>
3.2: updates text data in notes
</commit_message>
<xml_diff>
--- a/SpringSecurity-V7/src/main/resources/notes/Steps to Implement Security.docx
+++ b/SpringSecurity-V7/src/main/resources/notes/Steps to Implement Security.docx
@@ -96,6 +96,11 @@
             </a:graphic>
           </wp:inline>
         </w:drawing>
+      </w:r>
+    </w:p>
+    <w:p>
+      <w:r>
+        <w:t>Spring security is the framework</w:t>
       </w:r>
     </w:p>
     <w:sectPr>

</xml_diff>